<commit_message>
Finalize v0.18.0 release edition and publication metadata
</commit_message>
<xml_diff>
--- a/docs/manuals/01_ETIS_Engineering_Studio_Executive_Overview.docx
+++ b/docs/manuals/01_ETIS_Engineering_Studio_Executive_Overview.docx
@@ -38,7 +38,7 @@
     </w:p>
     <w:p>
       <w:r>
-        <w:t>v0.18.0 manual edition. Software release candidate; publication follows deployment acceptance.</w:t>
+        <w:t>v0.18.0 release manual edition. Production acceptance has separate source and deployment provenance.</w:t>
       </w:r>
     </w:p>
     <w:p>
@@ -284,7 +284,7 @@
                 <w:color w:val="22313F"/>
                 <w:sz w:val="17"/>
               </w:rPr>
-              <w:t>v0.18.0 release candidate</w:t>
+              <w:t>v0.18.0 release edition</w:t>
             </w:r>
           </w:p>
         </w:tc>

</xml_diff>